<commit_message>
docs: refine formatting and content across project documentation and research files
</commit_message>
<xml_diff>
--- a/Important Documents/Design_Requirement.docx
+++ b/Important Documents/Design_Requirement.docx
@@ -29,7 +29,7 @@
         <w:t xml:space="preserve">Navigators</w:t>
       </w:r>
       <w:r>
-        <w:t xml:space="preserve"> </w:t>
+        <w:br/>
       </w:r>
       <w:r>
         <w:rPr>
@@ -45,6 +45,13 @@
         <w:t xml:space="preserve">SIH26168</w:t>
       </w:r>
     </w:p>
+    <w:p>
+      <w:r>
+        <w:pict>
+          <v:rect style="width:0;height:1.5pt" o:hralign="center" o:hrstd="t" o:hr="t"/>
+        </w:pict>
+      </w:r>
+    </w:p>
     <w:bookmarkStart w:id="11" w:name="system-architecture"/>
     <w:p>
       <w:pPr>
@@ -90,7 +97,7 @@
         <w:t xml:space="preserve"> </w:t>
       </w:r>
       <w:r>
-        <w:t xml:space="preserve">Access raw data from smartphone sensors (Accelerometer, Gyroscope) at 10 Hz. (Up to 200 Hz for external FOG-IMU).</w:t>
+        <w:t xml:space="preserve">Access raw data from smartphone sensors (Accelerometer, Gyroscope) at 10 Hz. Supports up to 200 Hz for external FOG-IMU.</w:t>
       </w:r>
     </w:p>
     <w:p>
@@ -112,7 +119,7 @@
         <w:t xml:space="preserve"> </w:t>
       </w:r>
       <w:r>
-        <w:t xml:space="preserve">Noise filtering, vibration dampening, and gravity vector extraction. Calculates phone-to-vehicle alignment.</w:t>
+        <w:t xml:space="preserve">Employs non-linear median filtering and Butterworth low-pass filtering to isolate and remove physical shocks (e.g., potholes) without distorting kinematic data. Calculates phone-to-vehicle alignment.</w:t>
       </w:r>
     </w:p>
     <w:p>
@@ -134,7 +141,7 @@
         <w:t xml:space="preserve"> </w:t>
       </w:r>
       <w:r>
-        <w:t xml:space="preserve">A lightweight neural network (e.g., TCN, LSTM, or Transformer) designed to predict 2D velocity or displacement from windowed IMU data.</w:t>
+        <w:t xml:space="preserve">A lightweight neural network (Temporal Convolutional Network or LSTM) trained with rigorous data augmentations (noise injection, dynamic scaling). Designed to predict 2D velocity from windowed IMU data.</w:t>
       </w:r>
     </w:p>
     <w:p>
@@ -156,7 +163,7 @@
         <w:t xml:space="preserve"> </w:t>
       </w:r>
       <w:r>
-        <w:t xml:space="preserve">An Extended Kalman Filter to optimally fuse AI-predicted velocities with GNSS readings (when available).</w:t>
+        <w:t xml:space="preserve">A 15-state Extended Kalman Filter implemented entirely in JavaScript to optimally fuse AI-predicted velocities with GNSS readings (when available) directly on the edge.</w:t>
       </w:r>
     </w:p>
     <w:p>
@@ -178,7 +185,7 @@
         <w:t xml:space="preserve"> </w:t>
       </w:r>
       <w:r>
-        <w:t xml:space="preserve">Enforces Non-Holonomic Constraints (NHC).</w:t>
+        <w:t xml:space="preserve">Enforces Non-Holonomic Constraints (NHC) and Zero Velocity Updates (ZUPT) dynamically.</w:t>
       </w:r>
     </w:p>
     <w:p>
@@ -194,13 +201,35 @@
           <w:b/>
           <w:bCs/>
         </w:rPr>
+        <w:t xml:space="preserve">Map Matching Module:</w:t>
+      </w:r>
+      <w:r>
+        <w:t xml:space="preserve"> </w:t>
+      </w:r>
+      <w:r>
+        <w:t xml:space="preserve">Snaps estimated diverging trajectories back to known road centerlines using Geometric and Probabilistic (HMM) offline mapping.</w:t>
+      </w:r>
+    </w:p>
+    <w:p>
+      <w:pPr>
+        <w:pStyle w:val="Compact"/>
+        <w:numPr>
+          <w:ilvl w:val="0"/>
+          <w:numId w:val="1001"/>
+        </w:numPr>
+      </w:pPr>
+      <w:r>
+        <w:rPr>
+          <w:b/>
+          <w:bCs/>
+        </w:rPr>
         <w:t xml:space="preserve">UI/Visualizer:</w:t>
       </w:r>
       <w:r>
         <w:t xml:space="preserve"> </w:t>
       </w:r>
       <w:r>
-        <w:t xml:space="preserve">Renders the estimated trajectory continuously without jumping or freezing.</w:t>
+        <w:t xml:space="preserve">Renders the estimated trajectory continuously without jumping or freezing inside a Progressive Web App (PWA).</w:t>
       </w:r>
     </w:p>
     <w:bookmarkEnd w:id="9"/>
@@ -232,7 +261,7 @@
         <w:t xml:space="preserve"> </w:t>
       </w:r>
       <w:r>
-        <w:t xml:space="preserve">GNSS + IMU -&gt; AI/ML filtering -&gt; Fusion (EKF) -&gt; Map matching -&gt; Position</w:t>
+        <w:t xml:space="preserve">GNSS + IMU → AI/ML filtering → Fusion (EKF) → Map matching → Position</w:t>
       </w:r>
     </w:p>
     <w:p>
@@ -254,7 +283,7 @@
         <w:t xml:space="preserve"> </w:t>
       </w:r>
       <w:r>
-        <w:t xml:space="preserve">IMU -&gt; AI speed/motion estimation -&gt; Dead reckoning -&gt; NHC -&gt; Map matching -&gt; Position</w:t>
+        <w:t xml:space="preserve">IMU → AI speed/motion estimation → Dead reckoning → NHC &amp; ZUPT → Map matching → Position</w:t>
       </w:r>
     </w:p>
     <w:p>
@@ -276,7 +305,14 @@
         <w:t xml:space="preserve"> </w:t>
       </w:r>
       <w:r>
-        <w:t xml:space="preserve">Dead reckoning -&gt; Re-acquisition -&gt; GNSS + INS fusion -&gt; Corrected continuous position</w:t>
+        <w:t xml:space="preserve">Dead reckoning → Re-acquisition → GNSS + INS fusion → Corrected continuous position</w:t>
+      </w:r>
+    </w:p>
+    <w:p>
+      <w:r>
+        <w:pict>
+          <v:rect style="width:0;height:1.5pt" o:hralign="center" o:hrstd="t" o:hr="t"/>
+        </w:pict>
       </w:r>
     </w:p>
     <w:bookmarkEnd w:id="10"/>
@@ -309,7 +345,7 @@
         <w:t xml:space="preserve"> </w:t>
       </w:r>
       <w:r>
-        <w:t xml:space="preserve">PyTorch for training; ONNX or TensorFlow Lite for edge deployment.</w:t>
+        <w:t xml:space="preserve">PyTorch for training; ONNX Runtime Web for 100% offline edge deployment inside the browser.</w:t>
       </w:r>
     </w:p>
     <w:p>
@@ -331,7 +367,7 @@
         <w:t xml:space="preserve"> </w:t>
       </w:r>
       <w:r>
-        <w:t xml:space="preserve">Pandas, NumPy, SciPy for preprocessing.</w:t>
+        <w:t xml:space="preserve">Pandas, NumPy, SciPy for preprocessing and filtering.</w:t>
       </w:r>
     </w:p>
     <w:p>
@@ -347,13 +383,20 @@
           <w:b/>
           <w:bCs/>
         </w:rPr>
-        <w:t xml:space="preserve">Navigation &amp; Map Matching:</w:t>
+        <w:t xml:space="preserve">Navigation Engine:</w:t>
       </w:r>
       <w:r>
         <w:t xml:space="preserve"> </w:t>
       </w:r>
       <w:r>
-        <w:t xml:space="preserve">OSRM, Valhalla, or custom map matching heuristics.</w:t>
+        <w:t xml:space="preserve">Pure JavaScript implementation for EKF, NHC, ZUPT, and Map Matching to eliminate Python backend dependencies during deployment.</w:t>
+      </w:r>
+    </w:p>
+    <w:p>
+      <w:r>
+        <w:pict>
+          <v:rect style="width:0;height:1.5pt" o:hralign="center" o:hrstd="t" o:hr="t"/>
+        </w:pict>
       </w:r>
     </w:p>
     <w:bookmarkEnd w:id="12"/>
@@ -385,7 +428,7 @@
         <w:t xml:space="preserve"> </w:t>
       </w:r>
       <w:r>
-        <w:t xml:space="preserve">Workstation or Cloud instance with GPU (NVIDIA) for training on the 1.5GB IO-VNBD dataset.</w:t>
+        <w:t xml:space="preserve">Workstation or Cloud instance with GPU (NVIDIA) for training on the large IO-VNBD dataset.</w:t>
       </w:r>
     </w:p>
     <w:p>
@@ -407,7 +450,7 @@
         <w:t xml:space="preserve"> </w:t>
       </w:r>
       <w:r>
-        <w:t xml:space="preserve">Modern smartphone (Android/iOS) with capable IMU, or dedicated edge hardware for external IMU integration.</w:t>
+        <w:t xml:space="preserve">Modern smartphone (Android/iOS) with capable IMU, utilizing the CPU/NPU for WebAssembly inference, or dedicated edge hardware for external IMU integration.</w:t>
       </w:r>
     </w:p>
     <w:bookmarkEnd w:id="13"/>

</xml_diff>

<commit_message>
refactor: update project documentation and shift architecture to a FastAPI-based offline navigation backend
</commit_message>
<xml_diff>
--- a/Important Documents/Design_Requirement.docx
+++ b/Important Documents/Design_Requirement.docx
@@ -2,13 +2,22 @@
 <file path=word/document.xml><?xml version="1.0" encoding="utf-8"?>
 <w:document xmlns:w="http://schemas.openxmlformats.org/wordprocessingml/2006/main" xmlns:m="http://schemas.openxmlformats.org/officeDocument/2006/math" xmlns:r="http://schemas.openxmlformats.org/officeDocument/2006/relationships" xmlns:o="urn:schemas-microsoft-com:office:office" xmlns:v="urn:schemas-microsoft-com:vml" xmlns:w10="urn:schemas-microsoft-com:office:word" xmlns:a="http://schemas.openxmlformats.org/drawingml/2006/main" xmlns:pic="http://schemas.openxmlformats.org/drawingml/2006/picture" xmlns:wp="http://schemas.openxmlformats.org/drawingml/2006/wordprocessingDrawing">
   <w:body>
-    <w:bookmarkStart w:id="14" w:name="design-requirements"/>
+    <w:bookmarkStart w:id="17" w:name="design-requirements-architecture"/>
     <w:p>
       <w:pPr>
         <w:pStyle w:val="Heading1"/>
       </w:pPr>
       <w:r>
-        <w:t xml:space="preserve">Design Requirements</w:t>
+        <w:t xml:space="preserve">Design Requirements &amp; Architecture</w:t>
+      </w:r>
+    </w:p>
+    <w:bookmarkStart w:id="9" w:name="system-overview"/>
+    <w:p>
+      <w:pPr>
+        <w:pStyle w:val="Heading2"/>
+      </w:pPr>
+      <w:r>
+        <w:t xml:space="preserve">1. System Overview</w:t>
       </w:r>
     </w:p>
     <w:p>
@@ -16,66 +25,26 @@
         <w:pStyle w:val="FirstParagraph"/>
       </w:pPr>
       <w:r>
-        <w:rPr>
-          <w:b/>
-          <w:bCs/>
-        </w:rPr>
-        <w:t xml:space="preserve">Project Name:</w:t>
-      </w:r>
-      <w:r>
-        <w:t xml:space="preserve"> </w:t>
-      </w:r>
-      <w:r>
-        <w:t xml:space="preserve">Navigators</w:t>
-      </w:r>
-      <w:r>
-        <w:br/>
-      </w:r>
-      <w:r>
-        <w:rPr>
-          <w:b/>
-          <w:bCs/>
-        </w:rPr>
-        <w:t xml:space="preserve">SIH Problem Statement ID:</w:t>
-      </w:r>
-      <w:r>
-        <w:t xml:space="preserve"> </w:t>
-      </w:r>
-      <w:r>
-        <w:t xml:space="preserve">SIH26168</w:t>
-      </w:r>
-    </w:p>
-    <w:p>
-      <w:r>
-        <w:pict>
-          <v:rect style="width:0;height:1.5pt" o:hralign="center" o:hrstd="t" o:hr="t"/>
-        </w:pict>
-      </w:r>
-    </w:p>
-    <w:bookmarkStart w:id="11" w:name="system-architecture"/>
+        <w:t xml:space="preserve">The Navigators IDR system is composed of an advanced Python-based Navigation Engine executing an Extended Kalman Filter (EKF) and Temporal Convolutional Network (TCN) pipeline to maintain accurate GNSS-denied navigation.</w:t>
+      </w:r>
+    </w:p>
+    <w:bookmarkEnd w:id="9"/>
+    <w:bookmarkStart w:id="15" w:name="core-components"/>
     <w:p>
       <w:pPr>
         <w:pStyle w:val="Heading2"/>
       </w:pPr>
       <w:r>
-        <w:t xml:space="preserve">1. System Architecture</w:t>
-      </w:r>
-    </w:p>
-    <w:p>
-      <w:pPr>
-        <w:pStyle w:val="FirstParagraph"/>
-      </w:pPr>
-      <w:r>
-        <w:t xml:space="preserve">The system employs a 100% offline edge architecture focused entirely on edge inference to ensure real-time responsiveness and security when GNSS is denied. No backend or cloud dependency is allowed in the runtime.</w:t>
-      </w:r>
-    </w:p>
-    <w:bookmarkStart w:id="9" w:name="edge-engine-smartphone-external-imu"/>
+        <w:t xml:space="preserve">2. Core Components</w:t>
+      </w:r>
+    </w:p>
+    <w:bookmarkStart w:id="10" w:name="sensor-preprocessing"/>
     <w:p>
       <w:pPr>
         <w:pStyle w:val="Heading3"/>
       </w:pPr>
       <w:r>
-        <w:t xml:space="preserve">1.1 Edge Engine (Smartphone / External IMU)</w:t>
+        <w:t xml:space="preserve">2.1 Sensor Preprocessing</w:t>
       </w:r>
     </w:p>
     <w:p>
@@ -91,13 +60,13 @@
           <w:b/>
           <w:bCs/>
         </w:rPr>
-        <w:t xml:space="preserve">Sensor Interface:</w:t>
-      </w:r>
-      <w:r>
-        <w:t xml:space="preserve"> </w:t>
-      </w:r>
-      <w:r>
-        <w:t xml:space="preserve">Access raw data from smartphone sensors (Accelerometer, Gyroscope) at 10 Hz. Supports up to 200 Hz for external FOG-IMU.</w:t>
+        <w:t xml:space="preserve">Inputs:</w:t>
+      </w:r>
+      <w:r>
+        <w:t xml:space="preserve"> </w:t>
+      </w:r>
+      <w:r>
+        <w:t xml:space="preserve">3-axis Accelerometer, 3-axis Gyroscope.</w:t>
       </w:r>
     </w:p>
     <w:p>
@@ -113,13 +82,13 @@
           <w:b/>
           <w:bCs/>
         </w:rPr>
-        <w:t xml:space="preserve">Preprocessing Module:</w:t>
-      </w:r>
-      <w:r>
-        <w:t xml:space="preserve"> </w:t>
-      </w:r>
-      <w:r>
-        <w:t xml:space="preserve">Employs non-linear median filtering and Butterworth low-pass filtering to isolate and remove physical shocks (e.g., potholes) without distorting kinematic data. Calculates phone-to-vehicle alignment.</w:t>
+        <w:t xml:space="preserve">Filtering:</w:t>
+      </w:r>
+      <w:r>
+        <w:t xml:space="preserve"> </w:t>
+      </w:r>
+      <w:r>
+        <w:t xml:space="preserve">Applies a Median filter (window=5) to remove spike noise, followed by a 4th-order low-pass Butterworth filter (cutoff=2.5 Hz) to isolate vehicle dynamics from high-frequency vibrations.</w:t>
       </w:r>
     </w:p>
     <w:p>
@@ -135,111 +104,23 @@
           <w:b/>
           <w:bCs/>
         </w:rPr>
-        <w:t xml:space="preserve">AI Inference Engine:</w:t>
-      </w:r>
-      <w:r>
-        <w:t xml:space="preserve"> </w:t>
-      </w:r>
-      <w:r>
-        <w:t xml:space="preserve">A lightweight neural network (Temporal Convolutional Network or LSTM) trained with rigorous data augmentations (noise injection, dynamic scaling). Designed to predict 2D velocity from windowed IMU data.</w:t>
-      </w:r>
-    </w:p>
-    <w:p>
-      <w:pPr>
-        <w:pStyle w:val="Compact"/>
-        <w:numPr>
-          <w:ilvl w:val="0"/>
-          <w:numId w:val="1001"/>
-        </w:numPr>
-      </w:pPr>
-      <w:r>
-        <w:rPr>
-          <w:b/>
-          <w:bCs/>
-        </w:rPr>
-        <w:t xml:space="preserve">Sensor Fusion (EKF):</w:t>
-      </w:r>
-      <w:r>
-        <w:t xml:space="preserve"> </w:t>
-      </w:r>
-      <w:r>
-        <w:t xml:space="preserve">A 15-state Extended Kalman Filter implemented entirely in JavaScript to optimally fuse AI-predicted velocities with GNSS readings (when available) directly on the edge.</w:t>
-      </w:r>
-    </w:p>
-    <w:p>
-      <w:pPr>
-        <w:pStyle w:val="Compact"/>
-        <w:numPr>
-          <w:ilvl w:val="0"/>
-          <w:numId w:val="1001"/>
-        </w:numPr>
-      </w:pPr>
-      <w:r>
-        <w:rPr>
-          <w:b/>
-          <w:bCs/>
-        </w:rPr>
-        <w:t xml:space="preserve">Kinematic Constraints Module:</w:t>
-      </w:r>
-      <w:r>
-        <w:t xml:space="preserve"> </w:t>
-      </w:r>
-      <w:r>
-        <w:t xml:space="preserve">Enforces Non-Holonomic Constraints (NHC) and Zero Velocity Updates (ZUPT) dynamically.</w:t>
-      </w:r>
-    </w:p>
-    <w:p>
-      <w:pPr>
-        <w:pStyle w:val="Compact"/>
-        <w:numPr>
-          <w:ilvl w:val="0"/>
-          <w:numId w:val="1001"/>
-        </w:numPr>
-      </w:pPr>
-      <w:r>
-        <w:rPr>
-          <w:b/>
-          <w:bCs/>
-        </w:rPr>
-        <w:t xml:space="preserve">Map Matching Module:</w:t>
-      </w:r>
-      <w:r>
-        <w:t xml:space="preserve"> </w:t>
-      </w:r>
-      <w:r>
-        <w:t xml:space="preserve">Snaps estimated diverging trajectories back to known road centerlines using Geometric and Probabilistic (HMM) offline mapping.</w:t>
-      </w:r>
-    </w:p>
-    <w:p>
-      <w:pPr>
-        <w:pStyle w:val="Compact"/>
-        <w:numPr>
-          <w:ilvl w:val="0"/>
-          <w:numId w:val="1001"/>
-        </w:numPr>
-      </w:pPr>
-      <w:r>
-        <w:rPr>
-          <w:b/>
-          <w:bCs/>
-        </w:rPr>
-        <w:t xml:space="preserve">UI/Visualizer:</w:t>
-      </w:r>
-      <w:r>
-        <w:t xml:space="preserve"> </w:t>
-      </w:r>
-      <w:r>
-        <w:t xml:space="preserve">Renders the estimated trajectory continuously without jumping or freezing inside a Progressive Web App (PWA).</w:t>
-      </w:r>
-    </w:p>
-    <w:bookmarkEnd w:id="9"/>
-    <w:bookmarkStart w:id="10" w:name="processing-flow"/>
+        <w:t xml:space="preserve">Alignment:</w:t>
+      </w:r>
+      <w:r>
+        <w:t xml:space="preserve"> </w:t>
+      </w:r>
+      <w:r>
+        <w:t xml:space="preserve">Uses Principal Component Analysis (PCA) to align the smartphone’s arbitrary coordinate frame to the vehicle’s forward axis, alongside gravity estimation to determine Pitch and Roll.</w:t>
+      </w:r>
+    </w:p>
+    <w:bookmarkEnd w:id="10"/>
+    <w:bookmarkStart w:id="11" w:name="deep-learning-velocity-model-tcn"/>
     <w:p>
       <w:pPr>
         <w:pStyle w:val="Heading3"/>
       </w:pPr>
       <w:r>
-        <w:t xml:space="preserve">1.2 Processing Flow</w:t>
+        <w:t xml:space="preserve">2.2 Deep Learning Velocity Model (TCN)</w:t>
       </w:r>
     </w:p>
     <w:p>
@@ -255,13 +136,13 @@
           <w:b/>
           <w:bCs/>
         </w:rPr>
-        <w:t xml:space="preserve">GNSS Available:</w:t>
-      </w:r>
-      <w:r>
-        <w:t xml:space="preserve"> </w:t>
-      </w:r>
-      <w:r>
-        <w:t xml:space="preserve">GNSS + IMU → AI/ML filtering → Fusion (EKF) → Map matching → Position</w:t>
+        <w:t xml:space="preserve">Architecture:</w:t>
+      </w:r>
+      <w:r>
+        <w:t xml:space="preserve"> </w:t>
+      </w:r>
+      <w:r>
+        <w:t xml:space="preserve">Temporal Convolutional Network (TCN).</w:t>
       </w:r>
     </w:p>
     <w:p>
@@ -277,13 +158,13 @@
           <w:b/>
           <w:bCs/>
         </w:rPr>
-        <w:t xml:space="preserve">GNSS Lost:</w:t>
-      </w:r>
-      <w:r>
-        <w:t xml:space="preserve"> </w:t>
-      </w:r>
-      <w:r>
-        <w:t xml:space="preserve">IMU → AI speed/motion estimation → Dead reckoning → NHC &amp; ZUPT → Map matching → Position</w:t>
+        <w:t xml:space="preserve">Input:</w:t>
+      </w:r>
+      <w:r>
+        <w:t xml:space="preserve"> </w:t>
+      </w:r>
+      <w:r>
+        <w:t xml:space="preserve">200-sample sliding window of aligned 6-DOF IMU data (approx. 20 seconds at 10Hz).</w:t>
       </w:r>
     </w:p>
     <w:p>
@@ -299,31 +180,444 @@
           <w:b/>
           <w:bCs/>
         </w:rPr>
-        <w:t xml:space="preserve">GNSS Returns:</w:t>
-      </w:r>
-      <w:r>
-        <w:t xml:space="preserve"> </w:t>
-      </w:r>
-      <w:r>
-        <w:t xml:space="preserve">Dead reckoning → Re-acquisition → GNSS + INS fusion → Corrected continuous position</w:t>
-      </w:r>
-    </w:p>
-    <w:p>
-      <w:r>
-        <w:pict>
-          <v:rect style="width:0;height:1.5pt" o:hralign="center" o:hrstd="t" o:hr="t"/>
-        </w:pict>
-      </w:r>
-    </w:p>
-    <w:bookmarkEnd w:id="10"/>
+        <w:t xml:space="preserve">Output:</w:t>
+      </w:r>
+      <w:r>
+        <w:t xml:space="preserve"> </w:t>
+      </w:r>
+      <w:r>
+        <w:t xml:space="preserve">2D horizontal velocity vector (</w:t>
+      </w:r>
+      <m:oMath>
+        <m:sSub>
+          <m:e>
+            <m:r>
+              <m:t>v</m:t>
+            </m:r>
+          </m:e>
+          <m:sub>
+            <m:r>
+              <m:t>e</m:t>
+            </m:r>
+            <m:r>
+              <m:t>a</m:t>
+            </m:r>
+            <m:r>
+              <m:t>s</m:t>
+            </m:r>
+            <m:r>
+              <m:t>t</m:t>
+            </m:r>
+          </m:sub>
+        </m:sSub>
+      </m:oMath>
+      <w:r>
+        <w:t xml:space="preserve">,</w:t>
+      </w:r>
+      <w:r>
+        <w:t xml:space="preserve"> </w:t>
+      </w:r>
+      <m:oMath>
+        <m:sSub>
+          <m:e>
+            <m:r>
+              <m:t>v</m:t>
+            </m:r>
+          </m:e>
+          <m:sub>
+            <m:r>
+              <m:t>n</m:t>
+            </m:r>
+            <m:r>
+              <m:t>o</m:t>
+            </m:r>
+            <m:r>
+              <m:t>r</m:t>
+            </m:r>
+            <m:r>
+              <m:t>t</m:t>
+            </m:r>
+            <m:r>
+              <m:t>h</m:t>
+            </m:r>
+          </m:sub>
+        </m:sSub>
+      </m:oMath>
+      <w:r>
+        <w:t xml:space="preserve">).</w:t>
+      </w:r>
+    </w:p>
+    <w:p>
+      <w:pPr>
+        <w:pStyle w:val="Compact"/>
+        <w:numPr>
+          <w:ilvl w:val="0"/>
+          <w:numId w:val="1002"/>
+        </w:numPr>
+      </w:pPr>
+      <w:r>
+        <w:rPr>
+          <w:b/>
+          <w:bCs/>
+        </w:rPr>
+        <w:t xml:space="preserve">Deployment:</w:t>
+      </w:r>
+      <w:r>
+        <w:t xml:space="preserve"> </w:t>
+      </w:r>
+      <w:r>
+        <w:t xml:space="preserve">Exported as an ONNX model for high-performance, edge-optimized inference.</w:t>
+      </w:r>
+    </w:p>
     <w:bookmarkEnd w:id="11"/>
-    <w:bookmarkStart w:id="12" w:name="software-requirements"/>
-    <w:p>
-      <w:pPr>
-        <w:pStyle w:val="Heading2"/>
-      </w:pPr>
-      <w:r>
-        <w:t xml:space="preserve">2. Software Requirements</w:t>
+    <w:bookmarkStart w:id="12" w:name="extended-kalman-filter-ekf"/>
+    <w:p>
+      <w:pPr>
+        <w:pStyle w:val="Heading3"/>
+      </w:pPr>
+      <w:r>
+        <w:t xml:space="preserve">2.3 Extended Kalman Filter (EKF)</w:t>
+      </w:r>
+    </w:p>
+    <w:p>
+      <w:pPr>
+        <w:pStyle w:val="FirstParagraph"/>
+      </w:pPr>
+      <w:r>
+        <w:t xml:space="preserve">The central data fusion hub.</w:t>
+      </w:r>
+      <w:r>
+        <w:t xml:space="preserve"> </w:t>
+      </w:r>
+      <w:r>
+        <w:t xml:space="preserve">-</w:t>
+      </w:r>
+      <w:r>
+        <w:t xml:space="preserve"> </w:t>
+      </w:r>
+      <w:r>
+        <w:rPr>
+          <w:b/>
+          <w:bCs/>
+        </w:rPr>
+        <w:t xml:space="preserve">State Vector (</w:t>
+      </w:r>
+      <m:oMath>
+        <m:sSub>
+          <m:e>
+            <m:r>
+              <m:t>x</m:t>
+            </m:r>
+          </m:e>
+          <m:sub>
+            <m:r>
+              <m:t>15</m:t>
+            </m:r>
+            <m:r>
+              <m:rPr>
+                <m:sty m:val="p"/>
+              </m:rPr>
+              <m:t>×</m:t>
+            </m:r>
+            <m:r>
+              <m:t>1</m:t>
+            </m:r>
+          </m:sub>
+        </m:sSub>
+      </m:oMath>
+      <w:r>
+        <w:rPr>
+          <w:b/>
+          <w:bCs/>
+        </w:rPr>
+        <w:t xml:space="preserve">):</w:t>
+      </w:r>
+      <w:r>
+        <w:t xml:space="preserve"> </w:t>
+      </w:r>
+      <w:r>
+        <w:t xml:space="preserve">- Position (</w:t>
+      </w:r>
+      <m:oMath>
+        <m:r>
+          <m:t>x</m:t>
+        </m:r>
+        <m:r>
+          <m:rPr>
+            <m:sty m:val="p"/>
+          </m:rPr>
+          <m:t>,</m:t>
+        </m:r>
+        <m:r>
+          <m:t>y</m:t>
+        </m:r>
+        <m:r>
+          <m:rPr>
+            <m:sty m:val="p"/>
+          </m:rPr>
+          <m:t>,</m:t>
+        </m:r>
+        <m:r>
+          <m:t>z</m:t>
+        </m:r>
+      </m:oMath>
+      <w:r>
+        <w:t xml:space="preserve">)</w:t>
+      </w:r>
+      <w:r>
+        <w:t xml:space="preserve"> </w:t>
+      </w:r>
+      <w:r>
+        <w:t xml:space="preserve">- Velocity (</w:t>
+      </w:r>
+      <m:oMath>
+        <m:sSub>
+          <m:e>
+            <m:r>
+              <m:t>v</m:t>
+            </m:r>
+          </m:e>
+          <m:sub>
+            <m:r>
+              <m:t>x</m:t>
+            </m:r>
+          </m:sub>
+        </m:sSub>
+        <m:r>
+          <m:rPr>
+            <m:sty m:val="p"/>
+          </m:rPr>
+          <m:t>,</m:t>
+        </m:r>
+        <m:sSub>
+          <m:e>
+            <m:r>
+              <m:t>v</m:t>
+            </m:r>
+          </m:e>
+          <m:sub>
+            <m:r>
+              <m:t>y</m:t>
+            </m:r>
+          </m:sub>
+        </m:sSub>
+        <m:r>
+          <m:rPr>
+            <m:sty m:val="p"/>
+          </m:rPr>
+          <m:t>,</m:t>
+        </m:r>
+        <m:sSub>
+          <m:e>
+            <m:r>
+              <m:t>v</m:t>
+            </m:r>
+          </m:e>
+          <m:sub>
+            <m:r>
+              <m:t>z</m:t>
+            </m:r>
+          </m:sub>
+        </m:sSub>
+      </m:oMath>
+      <w:r>
+        <w:t xml:space="preserve">)</w:t>
+      </w:r>
+      <w:r>
+        <w:t xml:space="preserve"> </w:t>
+      </w:r>
+      <w:r>
+        <w:t xml:space="preserve">- Orientation (Roll, Pitch, Yaw)</w:t>
+      </w:r>
+      <w:r>
+        <w:t xml:space="preserve"> </w:t>
+      </w:r>
+      <w:r>
+        <w:t xml:space="preserve">- Accelerometer Bias (</w:t>
+      </w:r>
+      <m:oMath>
+        <m:sSub>
+          <m:e>
+            <m:r>
+              <m:t>b</m:t>
+            </m:r>
+          </m:e>
+          <m:sub>
+            <m:r>
+              <m:t>a</m:t>
+            </m:r>
+            <m:r>
+              <m:t>x</m:t>
+            </m:r>
+          </m:sub>
+        </m:sSub>
+        <m:r>
+          <m:rPr>
+            <m:sty m:val="p"/>
+          </m:rPr>
+          <m:t>,</m:t>
+        </m:r>
+        <m:sSub>
+          <m:e>
+            <m:r>
+              <m:t>b</m:t>
+            </m:r>
+          </m:e>
+          <m:sub>
+            <m:r>
+              <m:t>a</m:t>
+            </m:r>
+            <m:r>
+              <m:t>y</m:t>
+            </m:r>
+          </m:sub>
+        </m:sSub>
+        <m:r>
+          <m:rPr>
+            <m:sty m:val="p"/>
+          </m:rPr>
+          <m:t>,</m:t>
+        </m:r>
+        <m:sSub>
+          <m:e>
+            <m:r>
+              <m:t>b</m:t>
+            </m:r>
+          </m:e>
+          <m:sub>
+            <m:r>
+              <m:t>a</m:t>
+            </m:r>
+            <m:r>
+              <m:t>z</m:t>
+            </m:r>
+          </m:sub>
+        </m:sSub>
+      </m:oMath>
+      <w:r>
+        <w:t xml:space="preserve">)</w:t>
+      </w:r>
+      <w:r>
+        <w:t xml:space="preserve"> </w:t>
+      </w:r>
+      <w:r>
+        <w:t xml:space="preserve">- Gyroscope Bias (</w:t>
+      </w:r>
+      <m:oMath>
+        <m:sSub>
+          <m:e>
+            <m:r>
+              <m:t>b</m:t>
+            </m:r>
+          </m:e>
+          <m:sub>
+            <m:r>
+              <m:t>g</m:t>
+            </m:r>
+            <m:r>
+              <m:t>x</m:t>
+            </m:r>
+          </m:sub>
+        </m:sSub>
+        <m:r>
+          <m:rPr>
+            <m:sty m:val="p"/>
+          </m:rPr>
+          <m:t>,</m:t>
+        </m:r>
+        <m:sSub>
+          <m:e>
+            <m:r>
+              <m:t>b</m:t>
+            </m:r>
+          </m:e>
+          <m:sub>
+            <m:r>
+              <m:t>g</m:t>
+            </m:r>
+            <m:r>
+              <m:t>y</m:t>
+            </m:r>
+          </m:sub>
+        </m:sSub>
+        <m:r>
+          <m:rPr>
+            <m:sty m:val="p"/>
+          </m:rPr>
+          <m:t>,</m:t>
+        </m:r>
+        <m:sSub>
+          <m:e>
+            <m:r>
+              <m:t>b</m:t>
+            </m:r>
+          </m:e>
+          <m:sub>
+            <m:r>
+              <m:t>g</m:t>
+            </m:r>
+            <m:r>
+              <m:t>z</m:t>
+            </m:r>
+          </m:sub>
+        </m:sSub>
+      </m:oMath>
+      <w:r>
+        <w:t xml:space="preserve">)</w:t>
+      </w:r>
+      <w:r>
+        <w:t xml:space="preserve"> </w:t>
+      </w:r>
+      <w:r>
+        <w:t xml:space="preserve">-</w:t>
+      </w:r>
+      <w:r>
+        <w:t xml:space="preserve"> </w:t>
+      </w:r>
+      <w:r>
+        <w:rPr>
+          <w:b/>
+          <w:bCs/>
+        </w:rPr>
+        <w:t xml:space="preserve">Process Model:</w:t>
+      </w:r>
+      <w:r>
+        <w:t xml:space="preserve"> </w:t>
+      </w:r>
+      <w:r>
+        <w:t xml:space="preserve">Integrates raw IMU data using the strapdown inertial navigation equations.</w:t>
+      </w:r>
+      <w:r>
+        <w:t xml:space="preserve"> </w:t>
+      </w:r>
+      <w:r>
+        <w:t xml:space="preserve">-</w:t>
+      </w:r>
+      <w:r>
+        <w:t xml:space="preserve"> </w:t>
+      </w:r>
+      <w:r>
+        <w:rPr>
+          <w:b/>
+          <w:bCs/>
+        </w:rPr>
+        <w:t xml:space="preserve">Measurement Model:</w:t>
+      </w:r>
+      <w:r>
+        <w:t xml:space="preserve"> </w:t>
+      </w:r>
+      <w:r>
+        <w:t xml:space="preserve">Fuses absolute GNSS fixes when available. When GNSS is denied, it fuses the AI-predicted 2D velocity as a highly-weighted pseudo-measurement.</w:t>
+      </w:r>
+    </w:p>
+    <w:bookmarkEnd w:id="12"/>
+    <w:bookmarkStart w:id="13" w:name="constraints"/>
+    <w:p>
+      <w:pPr>
+        <w:pStyle w:val="Heading3"/>
+      </w:pPr>
+      <w:r>
+        <w:t xml:space="preserve">2.4 Constraints</w:t>
       </w:r>
     </w:p>
     <w:p>
@@ -339,13 +633,65 @@
           <w:b/>
           <w:bCs/>
         </w:rPr>
-        <w:t xml:space="preserve">AI/ML Framework:</w:t>
-      </w:r>
-      <w:r>
-        <w:t xml:space="preserve"> </w:t>
-      </w:r>
-      <w:r>
-        <w:t xml:space="preserve">PyTorch for training; ONNX Runtime Web for 100% offline edge deployment inside the browser.</w:t>
+        <w:t xml:space="preserve">NHC (Non-Holonomic Constraints):</w:t>
+      </w:r>
+      <w:r>
+        <w:t xml:space="preserve"> </w:t>
+      </w:r>
+      <w:r>
+        <w:t xml:space="preserve">Applies pseudo-measurements assuming lateral velocity (</w:t>
+      </w:r>
+      <m:oMath>
+        <m:sSub>
+          <m:e>
+            <m:r>
+              <m:t>v</m:t>
+            </m:r>
+          </m:e>
+          <m:sub>
+            <m:r>
+              <m:t>y</m:t>
+            </m:r>
+          </m:sub>
+        </m:sSub>
+        <m:r>
+          <m:rPr>
+            <m:sty m:val="p"/>
+          </m:rPr>
+          <m:t>≈</m:t>
+        </m:r>
+        <m:r>
+          <m:t>0</m:t>
+        </m:r>
+      </m:oMath>
+      <w:r>
+        <w:t xml:space="preserve">) and vertical velocity (</w:t>
+      </w:r>
+      <m:oMath>
+        <m:sSub>
+          <m:e>
+            <m:r>
+              <m:t>v</m:t>
+            </m:r>
+          </m:e>
+          <m:sub>
+            <m:r>
+              <m:t>z</m:t>
+            </m:r>
+          </m:sub>
+        </m:sSub>
+        <m:r>
+          <m:rPr>
+            <m:sty m:val="p"/>
+          </m:rPr>
+          <m:t>≈</m:t>
+        </m:r>
+        <m:r>
+          <m:t>0</m:t>
+        </m:r>
+      </m:oMath>
+      <w:r>
+        <w:t xml:space="preserve">) are zero in the vehicle frame.</w:t>
       </w:r>
     </w:p>
     <w:p>
@@ -361,52 +707,23 @@
           <w:b/>
           <w:bCs/>
         </w:rPr>
-        <w:t xml:space="preserve">Data Processing:</w:t>
-      </w:r>
-      <w:r>
-        <w:t xml:space="preserve"> </w:t>
-      </w:r>
-      <w:r>
-        <w:t xml:space="preserve">Pandas, NumPy, SciPy for preprocessing and filtering.</w:t>
-      </w:r>
-    </w:p>
-    <w:p>
-      <w:pPr>
-        <w:pStyle w:val="Compact"/>
-        <w:numPr>
-          <w:ilvl w:val="0"/>
-          <w:numId w:val="1003"/>
-        </w:numPr>
-      </w:pPr>
-      <w:r>
-        <w:rPr>
-          <w:b/>
-          <w:bCs/>
-        </w:rPr>
-        <w:t xml:space="preserve">Navigation Engine:</w:t>
-      </w:r>
-      <w:r>
-        <w:t xml:space="preserve"> </w:t>
-      </w:r>
-      <w:r>
-        <w:t xml:space="preserve">Pure JavaScript implementation for EKF, NHC, ZUPT, and Map Matching to eliminate Python backend dependencies during deployment.</w:t>
-      </w:r>
-    </w:p>
-    <w:p>
-      <w:r>
-        <w:pict>
-          <v:rect style="width:0;height:1.5pt" o:hralign="center" o:hrstd="t" o:hr="t"/>
-        </w:pict>
-      </w:r>
-    </w:p>
-    <w:bookmarkEnd w:id="12"/>
-    <w:bookmarkStart w:id="13" w:name="hardware-requirements"/>
-    <w:p>
-      <w:pPr>
-        <w:pStyle w:val="Heading2"/>
-      </w:pPr>
-      <w:r>
-        <w:t xml:space="preserve">3. Hardware Requirements</w:t>
+        <w:t xml:space="preserve">ZUPT (Zero-Velocity Update):</w:t>
+      </w:r>
+      <w:r>
+        <w:t xml:space="preserve"> </w:t>
+      </w:r>
+      <w:r>
+        <w:t xml:space="preserve">Uses acceleration variance thresholds to detect stops. When triggered, forces velocity to zero and heavily constrains covariance growth.</w:t>
+      </w:r>
+    </w:p>
+    <w:bookmarkEnd w:id="13"/>
+    <w:bookmarkStart w:id="14" w:name="map-matching"/>
+    <w:p>
+      <w:pPr>
+        <w:pStyle w:val="Heading3"/>
+      </w:pPr>
+      <w:r>
+        <w:t xml:space="preserve">2.5 Map Matching</w:t>
       </w:r>
     </w:p>
     <w:p>
@@ -418,17 +735,7 @@
         </w:numPr>
       </w:pPr>
       <w:r>
-        <w:rPr>
-          <w:b/>
-          <w:bCs/>
-        </w:rPr>
-        <w:t xml:space="preserve">Development:</w:t>
-      </w:r>
-      <w:r>
-        <w:t xml:space="preserve"> </w:t>
-      </w:r>
-      <w:r>
-        <w:t xml:space="preserve">Workstation or Cloud instance with GPU (NVIDIA) for training on the large IO-VNBD dataset.</w:t>
+        <w:t xml:space="preserve">A geometric and topological engine that uses a local offline road network graph.</w:t>
       </w:r>
     </w:p>
     <w:p>
@@ -440,21 +747,215 @@
         </w:numPr>
       </w:pPr>
       <w:r>
+        <w:t xml:space="preserve">Uses distance and heading thresholds to snap the EKF’s mathematical output to the most likely logical road segment.</w:t>
+      </w:r>
+    </w:p>
+    <w:bookmarkEnd w:id="14"/>
+    <w:bookmarkEnd w:id="15"/>
+    <w:bookmarkStart w:id="16" w:name="data-flow"/>
+    <w:p>
+      <w:pPr>
+        <w:pStyle w:val="Heading2"/>
+      </w:pPr>
+      <w:r>
+        <w:t xml:space="preserve">3. Data Flow</w:t>
+      </w:r>
+    </w:p>
+    <w:p>
+      <w:pPr>
+        <w:pStyle w:val="Compact"/>
+        <w:numPr>
+          <w:ilvl w:val="0"/>
+          <w:numId w:val="1005"/>
+        </w:numPr>
+      </w:pPr>
+      <w:r>
+        <w:t xml:space="preserve">Device Sensors -&gt; API Endpoint (</w:t>
+      </w:r>
+      <w:r>
         <w:rPr>
-          <w:b/>
-          <w:bCs/>
+          <w:rStyle w:val="VerbatimChar"/>
         </w:rPr>
-        <w:t xml:space="preserve">Deployment:</w:t>
-      </w:r>
-      <w:r>
-        <w:t xml:space="preserve"> </w:t>
-      </w:r>
-      <w:r>
-        <w:t xml:space="preserve">Modern smartphone (Android/iOS) with capable IMU, utilizing the CPU/NPU for WebAssembly inference, or dedicated edge hardware for external IMU integration.</w:t>
-      </w:r>
-    </w:p>
-    <w:bookmarkEnd w:id="13"/>
-    <w:bookmarkEnd w:id="14"/>
+        <w:t xml:space="preserve">POST /sensor/batch</w:t>
+      </w:r>
+      <w:r>
+        <w:t xml:space="preserve"> </w:t>
+      </w:r>
+      <w:r>
+        <w:t xml:space="preserve">or</w:t>
+      </w:r>
+      <w:r>
+        <w:t xml:space="preserve"> </w:t>
+      </w:r>
+      <w:r>
+        <w:rPr>
+          <w:rStyle w:val="VerbatimChar"/>
+        </w:rPr>
+        <w:t xml:space="preserve">/ws</w:t>
+      </w:r>
+      <w:r>
+        <w:t xml:space="preserve">).</w:t>
+      </w:r>
+    </w:p>
+    <w:p>
+      <w:pPr>
+        <w:pStyle w:val="Compact"/>
+        <w:numPr>
+          <w:ilvl w:val="0"/>
+          <w:numId w:val="1005"/>
+        </w:numPr>
+      </w:pPr>
+      <w:r>
+        <w:t xml:space="preserve">Data passes to</w:t>
+      </w:r>
+      <w:r>
+        <w:t xml:space="preserve"> </w:t>
+      </w:r>
+      <w:r>
+        <w:rPr>
+          <w:rStyle w:val="VerbatimChar"/>
+        </w:rPr>
+        <w:t xml:space="preserve">preprocessor.py</w:t>
+      </w:r>
+      <w:r>
+        <w:t xml:space="preserve">.</w:t>
+      </w:r>
+    </w:p>
+    <w:p>
+      <w:pPr>
+        <w:pStyle w:val="Compact"/>
+        <w:numPr>
+          <w:ilvl w:val="0"/>
+          <w:numId w:val="1005"/>
+        </w:numPr>
+      </w:pPr>
+      <w:r>
+        <w:t xml:space="preserve">Filtered data generates a 200-frame window.</w:t>
+      </w:r>
+    </w:p>
+    <w:p>
+      <w:pPr>
+        <w:pStyle w:val="Compact"/>
+        <w:numPr>
+          <w:ilvl w:val="0"/>
+          <w:numId w:val="1005"/>
+        </w:numPr>
+      </w:pPr>
+      <w:r>
+        <w:rPr>
+          <w:rStyle w:val="VerbatimChar"/>
+        </w:rPr>
+        <w:t xml:space="preserve">tcn_model.py</w:t>
+      </w:r>
+      <w:r>
+        <w:t xml:space="preserve"> </w:t>
+      </w:r>
+      <w:r>
+        <w:t xml:space="preserve">evaluates the window, yielding</w:t>
+      </w:r>
+      <w:r>
+        <w:t xml:space="preserve"> </w:t>
+      </w:r>
+      <m:oMath>
+        <m:sSub>
+          <m:e>
+            <m:r>
+              <m:t>v</m:t>
+            </m:r>
+          </m:e>
+          <m:sub>
+            <m:r>
+              <m:t>A</m:t>
+            </m:r>
+            <m:r>
+              <m:t>I</m:t>
+            </m:r>
+          </m:sub>
+        </m:sSub>
+      </m:oMath>
+      <w:r>
+        <w:t xml:space="preserve">.</w:t>
+      </w:r>
+    </w:p>
+    <w:p>
+      <w:pPr>
+        <w:pStyle w:val="Compact"/>
+        <w:numPr>
+          <w:ilvl w:val="0"/>
+          <w:numId w:val="1005"/>
+        </w:numPr>
+      </w:pPr>
+      <w:r>
+        <w:rPr>
+          <w:rStyle w:val="VerbatimChar"/>
+        </w:rPr>
+        <w:t xml:space="preserve">ekf.py</w:t>
+      </w:r>
+      <w:r>
+        <w:t xml:space="preserve"> </w:t>
+      </w:r>
+      <w:r>
+        <w:t xml:space="preserve">integrates the raw IMU data, then updates via GNSS, NHC, ZUPT, and</w:t>
+      </w:r>
+      <w:r>
+        <w:t xml:space="preserve"> </w:t>
+      </w:r>
+      <m:oMath>
+        <m:sSub>
+          <m:e>
+            <m:r>
+              <m:t>v</m:t>
+            </m:r>
+          </m:e>
+          <m:sub>
+            <m:r>
+              <m:t>A</m:t>
+            </m:r>
+            <m:r>
+              <m:t>I</m:t>
+            </m:r>
+          </m:sub>
+        </m:sSub>
+      </m:oMath>
+      <w:r>
+        <w:t xml:space="preserve">.</w:t>
+      </w:r>
+    </w:p>
+    <w:p>
+      <w:pPr>
+        <w:pStyle w:val="Compact"/>
+        <w:numPr>
+          <w:ilvl w:val="0"/>
+          <w:numId w:val="1005"/>
+        </w:numPr>
+      </w:pPr>
+      <w:r>
+        <w:rPr>
+          <w:rStyle w:val="VerbatimChar"/>
+        </w:rPr>
+        <w:t xml:space="preserve">map_matching.py</w:t>
+      </w:r>
+      <w:r>
+        <w:t xml:space="preserve"> </w:t>
+      </w:r>
+      <w:r>
+        <w:t xml:space="preserve">snaps the EKF’s position to the grid.</w:t>
+      </w:r>
+    </w:p>
+    <w:p>
+      <w:pPr>
+        <w:pStyle w:val="Compact"/>
+        <w:numPr>
+          <w:ilvl w:val="0"/>
+          <w:numId w:val="1005"/>
+        </w:numPr>
+      </w:pPr>
+      <w:r>
+        <w:t xml:space="preserve">System returns JSON payload with snapped coordinates and confidence metrics.</w:t>
+      </w:r>
+    </w:p>
+    <w:bookmarkEnd w:id="16"/>
+    <w:bookmarkEnd w:id="17"/>
     <w:sectPr>
       <w:footnotePr>
         <w:numRestart w:val="eachSect"/>
@@ -760,6 +1261,15 @@
     <w:abstractNumId w:val="991"/>
   </w:num>
   <w:num w:numId="1002">
+    <w:abstractNumId w:val="991"/>
+  </w:num>
+  <w:num w:numId="1003">
+    <w:abstractNumId w:val="991"/>
+  </w:num>
+  <w:num w:numId="1004">
+    <w:abstractNumId w:val="991"/>
+  </w:num>
+  <w:num w:numId="1005">
     <w:abstractNumId w:val="99411"/>
     <w:lvlOverride w:ilvl="0">
       <w:startOverride w:val="1"/>
@@ -788,12 +1298,6 @@
     <w:lvlOverride w:ilvl="8">
       <w:startOverride w:val="1"/>
     </w:lvlOverride>
-  </w:num>
-  <w:num w:numId="1003">
-    <w:abstractNumId w:val="991"/>
-  </w:num>
-  <w:num w:numId="1004">
-    <w:abstractNumId w:val="991"/>
   </w:num>
 </w:numbering>
 </file>

</xml_diff>

<commit_message>
feat: implement offline navigation pipeline, WebAssembly-based ONNX model execution, and comprehensive documentation updates
</commit_message>
<xml_diff>
--- a/Important Documents/Design_Requirement.docx
+++ b/Important Documents/Design_Requirement.docx
@@ -2,22 +2,34 @@
 <file path=word/document.xml><?xml version="1.0" encoding="utf-8"?>
 <w:document xmlns:w="http://schemas.openxmlformats.org/wordprocessingml/2006/main" xmlns:m="http://schemas.openxmlformats.org/officeDocument/2006/math" xmlns:r="http://schemas.openxmlformats.org/officeDocument/2006/relationships" xmlns:o="urn:schemas-microsoft-com:office:office" xmlns:v="urn:schemas-microsoft-com:vml" xmlns:w10="urn:schemas-microsoft-com:office:word" xmlns:a="http://schemas.openxmlformats.org/drawingml/2006/main" xmlns:pic="http://schemas.openxmlformats.org/drawingml/2006/picture" xmlns:wp="http://schemas.openxmlformats.org/drawingml/2006/wordprocessingDrawing">
   <w:body>
-    <w:bookmarkStart w:id="17" w:name="design-requirements-architecture"/>
+    <w:bookmarkStart w:id="14" w:name="navigators-idr-design-requirements"/>
     <w:p>
       <w:pPr>
         <w:pStyle w:val="Heading1"/>
       </w:pPr>
       <w:r>
-        <w:t xml:space="preserve">Design Requirements &amp; Architecture</w:t>
-      </w:r>
-    </w:p>
-    <w:bookmarkStart w:id="9" w:name="system-overview"/>
+        <w:t xml:space="preserve">Navigators IDR — Design Requirements</w:t>
+      </w:r>
+    </w:p>
+    <w:p>
+      <w:pPr>
+        <w:pStyle w:val="FirstParagraph"/>
+      </w:pPr>
+      <w:r>
+        <w:rPr>
+          <w:i/>
+          <w:iCs/>
+        </w:rPr>
+        <w:t xml:space="preserve">Smart India Hackathon 2026 (SIH26168) — ISRO Problem Statement</w:t>
+      </w:r>
+    </w:p>
+    <w:bookmarkStart w:id="9" w:name="system-objective"/>
     <w:p>
       <w:pPr>
         <w:pStyle w:val="Heading2"/>
       </w:pPr>
       <w:r>
-        <w:t xml:space="preserve">1. System Overview</w:t>
+        <w:t xml:space="preserve">1. System Objective</w:t>
       </w:r>
     </w:p>
     <w:p>
@@ -25,26 +37,17 @@
         <w:pStyle w:val="FirstParagraph"/>
       </w:pPr>
       <w:r>
-        <w:t xml:space="preserve">The Navigators IDR system is composed of an advanced Python-based Navigation Engine executing an Extended Kalman Filter (EKF) and Temporal Convolutional Network (TCN) pipeline to maintain accurate GNSS-denied navigation.</w:t>
+        <w:t xml:space="preserve">The system provides intelligent dead reckoning (IDR) using smartphone-only sensors to estimate vehicle trajectory during GNSS outages (e.g., tunnels, forests, urban canyons).</w:t>
       </w:r>
     </w:p>
     <w:bookmarkEnd w:id="9"/>
-    <w:bookmarkStart w:id="15" w:name="core-components"/>
+    <w:bookmarkStart w:id="10" w:name="hard-requirements"/>
     <w:p>
       <w:pPr>
         <w:pStyle w:val="Heading2"/>
       </w:pPr>
       <w:r>
-        <w:t xml:space="preserve">2. Core Components</w:t>
-      </w:r>
-    </w:p>
-    <w:bookmarkStart w:id="10" w:name="sensor-preprocessing"/>
-    <w:p>
-      <w:pPr>
-        <w:pStyle w:val="Heading3"/>
-      </w:pPr>
-      <w:r>
-        <w:t xml:space="preserve">2.1 Sensor Preprocessing</w:t>
+        <w:t xml:space="preserve">2. Hard Requirements</w:t>
       </w:r>
     </w:p>
     <w:p>
@@ -60,13 +63,10 @@
           <w:b/>
           <w:bCs/>
         </w:rPr>
-        <w:t xml:space="preserve">Inputs:</w:t>
-      </w:r>
-      <w:r>
-        <w:t xml:space="preserve"> </w:t>
-      </w:r>
-      <w:r>
-        <w:t xml:space="preserve">3-axis Accelerometer, 3-axis Gyroscope.</w:t>
+        <w:t xml:space="preserve">Smartphone-Only</w:t>
+      </w:r>
+      <w:r>
+        <w:t xml:space="preserve">: Must not rely on OBD-II, CAN bus, vehicle speedometers, or dedicated FOG-IMUs.</w:t>
       </w:r>
     </w:p>
     <w:p>
@@ -82,13 +82,23 @@
           <w:b/>
           <w:bCs/>
         </w:rPr>
-        <w:t xml:space="preserve">Filtering:</w:t>
+        <w:t xml:space="preserve">Offline Capable</w:t>
+      </w:r>
+      <w:r>
+        <w:t xml:space="preserve">: The core inference and EKF must run without an internet connection, allowing the frontend (JavaScript) to estimate position seamlessly. The Python backend is explicitly designated as a</w:t>
       </w:r>
       <w:r>
         <w:t xml:space="preserve"> </w:t>
       </w:r>
       <w:r>
-        <w:t xml:space="preserve">Applies a Median filter (window=5) to remove spike noise, followed by a 4th-order low-pass Butterworth filter (cutoff=2.5 Hz) to isolate vehicle dynamics from high-frequency vibrations.</w:t>
+        <w:rPr>
+          <w:b/>
+          <w:bCs/>
+        </w:rPr>
+        <w:t xml:space="preserve">development and testing tool</w:t>
+      </w:r>
+      <w:r>
+        <w:t xml:space="preserve">.</w:t>
       </w:r>
     </w:p>
     <w:p>
@@ -104,23 +114,20 @@
           <w:b/>
           <w:bCs/>
         </w:rPr>
-        <w:t xml:space="preserve">Alignment:</w:t>
-      </w:r>
-      <w:r>
-        <w:t xml:space="preserve"> </w:t>
-      </w:r>
-      <w:r>
-        <w:t xml:space="preserve">Uses Principal Component Analysis (PCA) to align the smartphone’s arbitrary coordinate frame to the vehicle’s forward axis, alongside gravity estimation to determine Pitch and Roll.</w:t>
+        <w:t xml:space="preserve">No Ground-Truth Leakage</w:t>
+      </w:r>
+      <w:r>
+        <w:t xml:space="preserve">: The estimator must never have access to ground-truth velocity or position during an outage.</w:t>
       </w:r>
     </w:p>
     <w:bookmarkEnd w:id="10"/>
-    <w:bookmarkStart w:id="11" w:name="deep-learning-velocity-model-tcn"/>
-    <w:p>
-      <w:pPr>
-        <w:pStyle w:val="Heading3"/>
-      </w:pPr>
-      <w:r>
-        <w:t xml:space="preserve">2.2 Deep Learning Velocity Model (TCN)</w:t>
+    <w:bookmarkStart w:id="11" w:name="core-architecture-components"/>
+    <w:p>
+      <w:pPr>
+        <w:pStyle w:val="Heading2"/>
+      </w:pPr>
+      <w:r>
+        <w:t xml:space="preserve">3. Core Architecture Components</w:t>
       </w:r>
     </w:p>
     <w:p>
@@ -136,13 +143,10 @@
           <w:b/>
           <w:bCs/>
         </w:rPr>
-        <w:t xml:space="preserve">Architecture:</w:t>
-      </w:r>
-      <w:r>
-        <w:t xml:space="preserve"> </w:t>
-      </w:r>
-      <w:r>
-        <w:t xml:space="preserve">Temporal Convolutional Network (TCN).</w:t>
+        <w:t xml:space="preserve">Sensor Interface</w:t>
+      </w:r>
+      <w:r>
+        <w:t xml:space="preserve">: Captures linear acceleration and gyroscope data at 100 Hz.</w:t>
       </w:r>
     </w:p>
     <w:p>
@@ -158,13 +162,10 @@
           <w:b/>
           <w:bCs/>
         </w:rPr>
-        <w:t xml:space="preserve">Input:</w:t>
-      </w:r>
-      <w:r>
-        <w:t xml:space="preserve"> </w:t>
-      </w:r>
-      <w:r>
-        <w:t xml:space="preserve">200-sample sliding window of aligned 6-DOF IMU data (approx. 20 seconds at 10Hz).</w:t>
+        <w:t xml:space="preserve">Phone-to-Vehicle Alignment</w:t>
+      </w:r>
+      <w:r>
+        <w:t xml:space="preserve">: Dynamically aligns the arbitrary smartphone frame to the vehicle’s Forward/Lateral/Vertical frame using gravity and forward acceleration vectors.</w:t>
       </w:r>
     </w:p>
     <w:p>
@@ -180,71 +181,10 @@
           <w:b/>
           <w:bCs/>
         </w:rPr>
-        <w:t xml:space="preserve">Output:</w:t>
-      </w:r>
-      <w:r>
-        <w:t xml:space="preserve"> </w:t>
-      </w:r>
-      <w:r>
-        <w:t xml:space="preserve">2D horizontal velocity vector (</w:t>
-      </w:r>
-      <m:oMath>
-        <m:sSub>
-          <m:e>
-            <m:r>
-              <m:t>v</m:t>
-            </m:r>
-          </m:e>
-          <m:sub>
-            <m:r>
-              <m:t>e</m:t>
-            </m:r>
-            <m:r>
-              <m:t>a</m:t>
-            </m:r>
-            <m:r>
-              <m:t>s</m:t>
-            </m:r>
-            <m:r>
-              <m:t>t</m:t>
-            </m:r>
-          </m:sub>
-        </m:sSub>
-      </m:oMath>
-      <w:r>
-        <w:t xml:space="preserve">,</w:t>
-      </w:r>
-      <w:r>
-        <w:t xml:space="preserve"> </w:t>
-      </w:r>
-      <m:oMath>
-        <m:sSub>
-          <m:e>
-            <m:r>
-              <m:t>v</m:t>
-            </m:r>
-          </m:e>
-          <m:sub>
-            <m:r>
-              <m:t>n</m:t>
-            </m:r>
-            <m:r>
-              <m:t>o</m:t>
-            </m:r>
-            <m:r>
-              <m:t>r</m:t>
-            </m:r>
-            <m:r>
-              <m:t>t</m:t>
-            </m:r>
-            <m:r>
-              <m:t>h</m:t>
-            </m:r>
-          </m:sub>
-        </m:sSub>
-      </m:oMath>
-      <w:r>
-        <w:t xml:space="preserve">).</w:t>
+        <w:t xml:space="preserve">Temporal Convolutional Network (TCN)</w:t>
+      </w:r>
+      <w:r>
+        <w:t xml:space="preserve">: A lightweight, low-latency ONNX model that predicts a 2D planar velocity vector from a 200-timestep window of IMU data.</w:t>
       </w:r>
     </w:p>
     <w:p>
@@ -260,310 +200,66 @@
           <w:b/>
           <w:bCs/>
         </w:rPr>
-        <w:t xml:space="preserve">Deployment:</w:t>
-      </w:r>
-      <w:r>
-        <w:t xml:space="preserve"> </w:t>
-      </w:r>
-      <w:r>
-        <w:t xml:space="preserve">Exported as an ONNX model for high-performance, edge-optimized inference.</w:t>
-      </w:r>
-    </w:p>
-    <w:bookmarkEnd w:id="11"/>
-    <w:bookmarkStart w:id="12" w:name="extended-kalman-filter-ekf"/>
-    <w:p>
-      <w:pPr>
-        <w:pStyle w:val="Heading3"/>
-      </w:pPr>
-      <w:r>
-        <w:t xml:space="preserve">2.3 Extended Kalman Filter (EKF)</w:t>
-      </w:r>
-    </w:p>
-    <w:p>
-      <w:pPr>
-        <w:pStyle w:val="FirstParagraph"/>
-      </w:pPr>
-      <w:r>
-        <w:t xml:space="preserve">The central data fusion hub.</w:t>
-      </w:r>
-      <w:r>
-        <w:t xml:space="preserve"> </w:t>
-      </w:r>
-      <w:r>
-        <w:t xml:space="preserve">-</w:t>
-      </w:r>
-      <w:r>
-        <w:t xml:space="preserve"> </w:t>
-      </w:r>
+        <w:t xml:space="preserve">15-State Extended Kalman Filter (EKF)</w:t>
+      </w:r>
+      <w:r>
+        <w:t xml:space="preserve">: Fuses the AI velocity predictions with raw IMU data, and incorporates GNSS when available.</w:t>
+      </w:r>
+    </w:p>
+    <w:p>
+      <w:pPr>
+        <w:pStyle w:val="Compact"/>
+        <w:numPr>
+          <w:ilvl w:val="0"/>
+          <w:numId w:val="1002"/>
+        </w:numPr>
+      </w:pPr>
       <w:r>
         <w:rPr>
           <w:b/>
           <w:bCs/>
         </w:rPr>
-        <w:t xml:space="preserve">State Vector (</w:t>
-      </w:r>
-      <m:oMath>
-        <m:sSub>
-          <m:e>
-            <m:r>
-              <m:t>x</m:t>
-            </m:r>
-          </m:e>
-          <m:sub>
-            <m:r>
-              <m:t>15</m:t>
-            </m:r>
-            <m:r>
-              <m:rPr>
-                <m:sty m:val="p"/>
-              </m:rPr>
-              <m:t>×</m:t>
-            </m:r>
-            <m:r>
-              <m:t>1</m:t>
-            </m:r>
-          </m:sub>
-        </m:sSub>
-      </m:oMath>
+        <w:t xml:space="preserve">Non-Holonomic Constraints (NHC)</w:t>
+      </w:r>
+      <w:r>
+        <w:t xml:space="preserve">: Restricts lateral and vertical velocity.</w:t>
+      </w:r>
+    </w:p>
+    <w:p>
+      <w:pPr>
+        <w:pStyle w:val="Compact"/>
+        <w:numPr>
+          <w:ilvl w:val="0"/>
+          <w:numId w:val="1002"/>
+        </w:numPr>
+      </w:pPr>
       <w:r>
         <w:rPr>
           <w:b/>
           <w:bCs/>
         </w:rPr>
-        <w:t xml:space="preserve">):</w:t>
-      </w:r>
-      <w:r>
-        <w:t xml:space="preserve"> </w:t>
-      </w:r>
-      <w:r>
-        <w:t xml:space="preserve">- Position (</w:t>
-      </w:r>
-      <m:oMath>
-        <m:r>
-          <m:t>x</m:t>
-        </m:r>
-        <m:r>
-          <m:rPr>
-            <m:sty m:val="p"/>
-          </m:rPr>
-          <m:t>,</m:t>
-        </m:r>
-        <m:r>
-          <m:t>y</m:t>
-        </m:r>
-        <m:r>
-          <m:rPr>
-            <m:sty m:val="p"/>
-          </m:rPr>
-          <m:t>,</m:t>
-        </m:r>
-        <m:r>
-          <m:t>z</m:t>
-        </m:r>
-      </m:oMath>
-      <w:r>
-        <w:t xml:space="preserve">)</w:t>
-      </w:r>
-      <w:r>
-        <w:t xml:space="preserve"> </w:t>
-      </w:r>
-      <w:r>
-        <w:t xml:space="preserve">- Velocity (</w:t>
-      </w:r>
-      <m:oMath>
-        <m:sSub>
-          <m:e>
-            <m:r>
-              <m:t>v</m:t>
-            </m:r>
-          </m:e>
-          <m:sub>
-            <m:r>
-              <m:t>x</m:t>
-            </m:r>
-          </m:sub>
-        </m:sSub>
-        <m:r>
-          <m:rPr>
-            <m:sty m:val="p"/>
-          </m:rPr>
-          <m:t>,</m:t>
-        </m:r>
-        <m:sSub>
-          <m:e>
-            <m:r>
-              <m:t>v</m:t>
-            </m:r>
-          </m:e>
-          <m:sub>
-            <m:r>
-              <m:t>y</m:t>
-            </m:r>
-          </m:sub>
-        </m:sSub>
-        <m:r>
-          <m:rPr>
-            <m:sty m:val="p"/>
-          </m:rPr>
-          <m:t>,</m:t>
-        </m:r>
-        <m:sSub>
-          <m:e>
-            <m:r>
-              <m:t>v</m:t>
-            </m:r>
-          </m:e>
-          <m:sub>
-            <m:r>
-              <m:t>z</m:t>
-            </m:r>
-          </m:sub>
-        </m:sSub>
-      </m:oMath>
-      <w:r>
-        <w:t xml:space="preserve">)</w:t>
-      </w:r>
-      <w:r>
-        <w:t xml:space="preserve"> </w:t>
-      </w:r>
-      <w:r>
-        <w:t xml:space="preserve">- Orientation (Roll, Pitch, Yaw)</w:t>
-      </w:r>
-      <w:r>
-        <w:t xml:space="preserve"> </w:t>
-      </w:r>
-      <w:r>
-        <w:t xml:space="preserve">- Accelerometer Bias (</w:t>
-      </w:r>
-      <m:oMath>
-        <m:sSub>
-          <m:e>
-            <m:r>
-              <m:t>b</m:t>
-            </m:r>
-          </m:e>
-          <m:sub>
-            <m:r>
-              <m:t>a</m:t>
-            </m:r>
-            <m:r>
-              <m:t>x</m:t>
-            </m:r>
-          </m:sub>
-        </m:sSub>
-        <m:r>
-          <m:rPr>
-            <m:sty m:val="p"/>
-          </m:rPr>
-          <m:t>,</m:t>
-        </m:r>
-        <m:sSub>
-          <m:e>
-            <m:r>
-              <m:t>b</m:t>
-            </m:r>
-          </m:e>
-          <m:sub>
-            <m:r>
-              <m:t>a</m:t>
-            </m:r>
-            <m:r>
-              <m:t>y</m:t>
-            </m:r>
-          </m:sub>
-        </m:sSub>
-        <m:r>
-          <m:rPr>
-            <m:sty m:val="p"/>
-          </m:rPr>
-          <m:t>,</m:t>
-        </m:r>
-        <m:sSub>
-          <m:e>
-            <m:r>
-              <m:t>b</m:t>
-            </m:r>
-          </m:e>
-          <m:sub>
-            <m:r>
-              <m:t>a</m:t>
-            </m:r>
-            <m:r>
-              <m:t>z</m:t>
-            </m:r>
-          </m:sub>
-        </m:sSub>
-      </m:oMath>
-      <w:r>
-        <w:t xml:space="preserve">)</w:t>
-      </w:r>
-      <w:r>
-        <w:t xml:space="preserve"> </w:t>
-      </w:r>
-      <w:r>
-        <w:t xml:space="preserve">- Gyroscope Bias (</w:t>
-      </w:r>
-      <m:oMath>
-        <m:sSub>
-          <m:e>
-            <m:r>
-              <m:t>b</m:t>
-            </m:r>
-          </m:e>
-          <m:sub>
-            <m:r>
-              <m:t>g</m:t>
-            </m:r>
-            <m:r>
-              <m:t>x</m:t>
-            </m:r>
-          </m:sub>
-        </m:sSub>
-        <m:r>
-          <m:rPr>
-            <m:sty m:val="p"/>
-          </m:rPr>
-          <m:t>,</m:t>
-        </m:r>
-        <m:sSub>
-          <m:e>
-            <m:r>
-              <m:t>b</m:t>
-            </m:r>
-          </m:e>
-          <m:sub>
-            <m:r>
-              <m:t>g</m:t>
-            </m:r>
-            <m:r>
-              <m:t>y</m:t>
-            </m:r>
-          </m:sub>
-        </m:sSub>
-        <m:r>
-          <m:rPr>
-            <m:sty m:val="p"/>
-          </m:rPr>
-          <m:t>,</m:t>
-        </m:r>
-        <m:sSub>
-          <m:e>
-            <m:r>
-              <m:t>b</m:t>
-            </m:r>
-          </m:e>
-          <m:sub>
-            <m:r>
-              <m:t>g</m:t>
-            </m:r>
-            <m:r>
-              <m:t>z</m:t>
-            </m:r>
-          </m:sub>
-        </m:sSub>
-      </m:oMath>
-      <w:r>
-        <w:t xml:space="preserve">)</w:t>
+        <w:t xml:space="preserve">Zero Velocity Updates (ZUPT)</w:t>
+      </w:r>
+      <w:r>
+        <w:t xml:space="preserve">: Freezes drift when the vehicle is stationary.</w:t>
+      </w:r>
+    </w:p>
+    <w:bookmarkEnd w:id="11"/>
+    <w:bookmarkStart w:id="12" w:name="data-collection-strategy"/>
+    <w:p>
+      <w:pPr>
+        <w:pStyle w:val="Heading2"/>
+      </w:pPr>
+      <w:r>
+        <w:t xml:space="preserve">4. Data Collection Strategy</w:t>
+      </w:r>
+    </w:p>
+    <w:p>
+      <w:pPr>
+        <w:pStyle w:val="FirstParagraph"/>
+      </w:pPr>
+      <w:r>
+        <w:t xml:space="preserve">To prevent the model from overfitting to a single vehicle or driver, the training dataset MUST be highly varied.</w:t>
       </w:r>
       <w:r>
         <w:t xml:space="preserve"> </w:t>
@@ -579,13 +275,10 @@
           <w:b/>
           <w:bCs/>
         </w:rPr>
-        <w:t xml:space="preserve">Process Model:</w:t>
-      </w:r>
-      <w:r>
-        <w:t xml:space="preserve"> </w:t>
-      </w:r>
-      <w:r>
-        <w:t xml:space="preserve">Integrates raw IMU data using the strapdown inertial navigation equations.</w:t>
+        <w:t xml:space="preserve">Road Types</w:t>
+      </w:r>
+      <w:r>
+        <w:t xml:space="preserve">: City, highway, residential, intersections, turns, roundabouts, traffic (stop-and-go), speed bumps, rough roads.</w:t>
       </w:r>
       <w:r>
         <w:t xml:space="preserve"> </w:t>
@@ -601,361 +294,61 @@
           <w:b/>
           <w:bCs/>
         </w:rPr>
-        <w:t xml:space="preserve">Measurement Model:</w:t>
+        <w:t xml:space="preserve">Driving Conditions</w:t>
+      </w:r>
+      <w:r>
+        <w:t xml:space="preserve">: Slow, medium, fast, acceleration, braking, stationary.</w:t>
       </w:r>
       <w:r>
         <w:t xml:space="preserve"> </w:t>
       </w:r>
       <w:r>
-        <w:t xml:space="preserve">Fuses absolute GNSS fixes when available. When GNSS is denied, it fuses the AI-predicted 2D velocity as a highly-weighted pseudo-measurement.</w:t>
-      </w:r>
-    </w:p>
-    <w:bookmarkEnd w:id="12"/>
-    <w:bookmarkStart w:id="13" w:name="constraints"/>
-    <w:p>
-      <w:pPr>
-        <w:pStyle w:val="Heading3"/>
-      </w:pPr>
-      <w:r>
-        <w:t xml:space="preserve">2.4 Constraints</w:t>
-      </w:r>
-    </w:p>
-    <w:p>
-      <w:pPr>
-        <w:pStyle w:val="Compact"/>
-        <w:numPr>
-          <w:ilvl w:val="0"/>
-          <w:numId w:val="1003"/>
-        </w:numPr>
-      </w:pPr>
+        <w:t xml:space="preserve">-</w:t>
+      </w:r>
+      <w:r>
+        <w:t xml:space="preserve"> </w:t>
+      </w:r>
       <w:r>
         <w:rPr>
           <w:b/>
           <w:bCs/>
         </w:rPr>
-        <w:t xml:space="preserve">NHC (Non-Holonomic Constraints):</w:t>
+        <w:t xml:space="preserve">Phone Conditions</w:t>
+      </w:r>
+      <w:r>
+        <w:t xml:space="preserve">: Different mounting angles, different mounting locations (dashboard, cupholder, windshield), different phone models.</w:t>
       </w:r>
       <w:r>
         <w:t xml:space="preserve"> </w:t>
       </w:r>
       <w:r>
-        <w:t xml:space="preserve">Applies pseudo-measurements assuming lateral velocity (</w:t>
-      </w:r>
-      <m:oMath>
-        <m:sSub>
-          <m:e>
-            <m:r>
-              <m:t>v</m:t>
-            </m:r>
-          </m:e>
-          <m:sub>
-            <m:r>
-              <m:t>y</m:t>
-            </m:r>
-          </m:sub>
-        </m:sSub>
-        <m:r>
-          <m:rPr>
-            <m:sty m:val="p"/>
-          </m:rPr>
-          <m:t>≈</m:t>
-        </m:r>
-        <m:r>
-          <m:t>0</m:t>
-        </m:r>
-      </m:oMath>
-      <w:r>
-        <w:t xml:space="preserve">) and vertical velocity (</w:t>
-      </w:r>
-      <m:oMath>
-        <m:sSub>
-          <m:e>
-            <m:r>
-              <m:t>v</m:t>
-            </m:r>
-          </m:e>
-          <m:sub>
-            <m:r>
-              <m:t>z</m:t>
-            </m:r>
-          </m:sub>
-        </m:sSub>
-        <m:r>
-          <m:rPr>
-            <m:sty m:val="p"/>
-          </m:rPr>
-          <m:t>≈</m:t>
-        </m:r>
-        <m:r>
-          <m:t>0</m:t>
-        </m:r>
-      </m:oMath>
-      <w:r>
-        <w:t xml:space="preserve">) are zero in the vehicle frame.</w:t>
-      </w:r>
-    </w:p>
-    <w:p>
-      <w:pPr>
-        <w:pStyle w:val="Compact"/>
-        <w:numPr>
-          <w:ilvl w:val="0"/>
-          <w:numId w:val="1003"/>
-        </w:numPr>
-      </w:pPr>
-      <w:r>
         <w:rPr>
-          <w:b/>
-          <w:bCs/>
+          <w:i/>
+          <w:iCs/>
         </w:rPr>
-        <w:t xml:space="preserve">ZUPT (Zero-Velocity Update):</w:t>
-      </w:r>
-      <w:r>
-        <w:t xml:space="preserve"> </w:t>
-      </w:r>
-      <w:r>
-        <w:t xml:space="preserve">Uses acceleration variance thresholds to detect stops. When triggered, forces velocity to zero and heavily constrains covariance growth.</w:t>
+        <w:t xml:space="preserve">Variety is significantly more valuable than total distance.</w:t>
+      </w:r>
+    </w:p>
+    <w:bookmarkEnd w:id="12"/>
+    <w:bookmarkStart w:id="13" w:name="benchmark-validation-status"/>
+    <w:p>
+      <w:pPr>
+        <w:pStyle w:val="Heading2"/>
+      </w:pPr>
+      <w:r>
+        <w:t xml:space="preserve">5. Benchmark Validation Status</w:t>
+      </w:r>
+    </w:p>
+    <w:p>
+      <w:pPr>
+        <w:pStyle w:val="FirstParagraph"/>
+      </w:pPr>
+      <w:r>
+        <w:t xml:space="preserve">Initial invalid benchmarks were flagged during forensic validation due to ground-truth leakage. The new benchmark suite cleanly firewalls ground truth. The system now trains purely on real-world datasets and achieves robust tracking during multi-distance GNSS outages using an offline, on-device WebAssembly execution pipeline.</w:t>
       </w:r>
     </w:p>
     <w:bookmarkEnd w:id="13"/>
-    <w:bookmarkStart w:id="14" w:name="map-matching"/>
-    <w:p>
-      <w:pPr>
-        <w:pStyle w:val="Heading3"/>
-      </w:pPr>
-      <w:r>
-        <w:t xml:space="preserve">2.5 Map Matching</w:t>
-      </w:r>
-    </w:p>
-    <w:p>
-      <w:pPr>
-        <w:pStyle w:val="Compact"/>
-        <w:numPr>
-          <w:ilvl w:val="0"/>
-          <w:numId w:val="1004"/>
-        </w:numPr>
-      </w:pPr>
-      <w:r>
-        <w:t xml:space="preserve">A geometric and topological engine that uses a local offline road network graph.</w:t>
-      </w:r>
-    </w:p>
-    <w:p>
-      <w:pPr>
-        <w:pStyle w:val="Compact"/>
-        <w:numPr>
-          <w:ilvl w:val="0"/>
-          <w:numId w:val="1004"/>
-        </w:numPr>
-      </w:pPr>
-      <w:r>
-        <w:t xml:space="preserve">Uses distance and heading thresholds to snap the EKF’s mathematical output to the most likely logical road segment.</w:t>
-      </w:r>
-    </w:p>
     <w:bookmarkEnd w:id="14"/>
-    <w:bookmarkEnd w:id="15"/>
-    <w:bookmarkStart w:id="16" w:name="data-flow"/>
-    <w:p>
-      <w:pPr>
-        <w:pStyle w:val="Heading2"/>
-      </w:pPr>
-      <w:r>
-        <w:t xml:space="preserve">3. Data Flow</w:t>
-      </w:r>
-    </w:p>
-    <w:p>
-      <w:pPr>
-        <w:pStyle w:val="Compact"/>
-        <w:numPr>
-          <w:ilvl w:val="0"/>
-          <w:numId w:val="1005"/>
-        </w:numPr>
-      </w:pPr>
-      <w:r>
-        <w:t xml:space="preserve">Device Sensors -&gt; API Endpoint (</w:t>
-      </w:r>
-      <w:r>
-        <w:rPr>
-          <w:rStyle w:val="VerbatimChar"/>
-        </w:rPr>
-        <w:t xml:space="preserve">POST /sensor/batch</w:t>
-      </w:r>
-      <w:r>
-        <w:t xml:space="preserve"> </w:t>
-      </w:r>
-      <w:r>
-        <w:t xml:space="preserve">or</w:t>
-      </w:r>
-      <w:r>
-        <w:t xml:space="preserve"> </w:t>
-      </w:r>
-      <w:r>
-        <w:rPr>
-          <w:rStyle w:val="VerbatimChar"/>
-        </w:rPr>
-        <w:t xml:space="preserve">/ws</w:t>
-      </w:r>
-      <w:r>
-        <w:t xml:space="preserve">).</w:t>
-      </w:r>
-    </w:p>
-    <w:p>
-      <w:pPr>
-        <w:pStyle w:val="Compact"/>
-        <w:numPr>
-          <w:ilvl w:val="0"/>
-          <w:numId w:val="1005"/>
-        </w:numPr>
-      </w:pPr>
-      <w:r>
-        <w:t xml:space="preserve">Data passes to</w:t>
-      </w:r>
-      <w:r>
-        <w:t xml:space="preserve"> </w:t>
-      </w:r>
-      <w:r>
-        <w:rPr>
-          <w:rStyle w:val="VerbatimChar"/>
-        </w:rPr>
-        <w:t xml:space="preserve">preprocessor.py</w:t>
-      </w:r>
-      <w:r>
-        <w:t xml:space="preserve">.</w:t>
-      </w:r>
-    </w:p>
-    <w:p>
-      <w:pPr>
-        <w:pStyle w:val="Compact"/>
-        <w:numPr>
-          <w:ilvl w:val="0"/>
-          <w:numId w:val="1005"/>
-        </w:numPr>
-      </w:pPr>
-      <w:r>
-        <w:t xml:space="preserve">Filtered data generates a 200-frame window.</w:t>
-      </w:r>
-    </w:p>
-    <w:p>
-      <w:pPr>
-        <w:pStyle w:val="Compact"/>
-        <w:numPr>
-          <w:ilvl w:val="0"/>
-          <w:numId w:val="1005"/>
-        </w:numPr>
-      </w:pPr>
-      <w:r>
-        <w:rPr>
-          <w:rStyle w:val="VerbatimChar"/>
-        </w:rPr>
-        <w:t xml:space="preserve">tcn_model.py</w:t>
-      </w:r>
-      <w:r>
-        <w:t xml:space="preserve"> </w:t>
-      </w:r>
-      <w:r>
-        <w:t xml:space="preserve">evaluates the window, yielding</w:t>
-      </w:r>
-      <w:r>
-        <w:t xml:space="preserve"> </w:t>
-      </w:r>
-      <m:oMath>
-        <m:sSub>
-          <m:e>
-            <m:r>
-              <m:t>v</m:t>
-            </m:r>
-          </m:e>
-          <m:sub>
-            <m:r>
-              <m:t>A</m:t>
-            </m:r>
-            <m:r>
-              <m:t>I</m:t>
-            </m:r>
-          </m:sub>
-        </m:sSub>
-      </m:oMath>
-      <w:r>
-        <w:t xml:space="preserve">.</w:t>
-      </w:r>
-    </w:p>
-    <w:p>
-      <w:pPr>
-        <w:pStyle w:val="Compact"/>
-        <w:numPr>
-          <w:ilvl w:val="0"/>
-          <w:numId w:val="1005"/>
-        </w:numPr>
-      </w:pPr>
-      <w:r>
-        <w:rPr>
-          <w:rStyle w:val="VerbatimChar"/>
-        </w:rPr>
-        <w:t xml:space="preserve">ekf.py</w:t>
-      </w:r>
-      <w:r>
-        <w:t xml:space="preserve"> </w:t>
-      </w:r>
-      <w:r>
-        <w:t xml:space="preserve">integrates the raw IMU data, then updates via GNSS, NHC, ZUPT, and</w:t>
-      </w:r>
-      <w:r>
-        <w:t xml:space="preserve"> </w:t>
-      </w:r>
-      <m:oMath>
-        <m:sSub>
-          <m:e>
-            <m:r>
-              <m:t>v</m:t>
-            </m:r>
-          </m:e>
-          <m:sub>
-            <m:r>
-              <m:t>A</m:t>
-            </m:r>
-            <m:r>
-              <m:t>I</m:t>
-            </m:r>
-          </m:sub>
-        </m:sSub>
-      </m:oMath>
-      <w:r>
-        <w:t xml:space="preserve">.</w:t>
-      </w:r>
-    </w:p>
-    <w:p>
-      <w:pPr>
-        <w:pStyle w:val="Compact"/>
-        <w:numPr>
-          <w:ilvl w:val="0"/>
-          <w:numId w:val="1005"/>
-        </w:numPr>
-      </w:pPr>
-      <w:r>
-        <w:rPr>
-          <w:rStyle w:val="VerbatimChar"/>
-        </w:rPr>
-        <w:t xml:space="preserve">map_matching.py</w:t>
-      </w:r>
-      <w:r>
-        <w:t xml:space="preserve"> </w:t>
-      </w:r>
-      <w:r>
-        <w:t xml:space="preserve">snaps the EKF’s position to the grid.</w:t>
-      </w:r>
-    </w:p>
-    <w:p>
-      <w:pPr>
-        <w:pStyle w:val="Compact"/>
-        <w:numPr>
-          <w:ilvl w:val="0"/>
-          <w:numId w:val="1005"/>
-        </w:numPr>
-      </w:pPr>
-      <w:r>
-        <w:t xml:space="preserve">System returns JSON payload with snapped coordinates and confidence metrics.</w:t>
-      </w:r>
-    </w:p>
-    <w:bookmarkEnd w:id="16"/>
-    <w:bookmarkEnd w:id="17"/>
     <w:sectPr>
       <w:footnotePr>
         <w:numRestart w:val="eachSect"/>
@@ -1261,15 +654,6 @@
     <w:abstractNumId w:val="991"/>
   </w:num>
   <w:num w:numId="1002">
-    <w:abstractNumId w:val="991"/>
-  </w:num>
-  <w:num w:numId="1003">
-    <w:abstractNumId w:val="991"/>
-  </w:num>
-  <w:num w:numId="1004">
-    <w:abstractNumId w:val="991"/>
-  </w:num>
-  <w:num w:numId="1005">
     <w:abstractNumId w:val="99411"/>
     <w:lvlOverride w:ilvl="0">
       <w:startOverride w:val="1"/>

</xml_diff>